<commit_message>
docs: sincroniza copias finais
</commit_message>
<xml_diff>
--- a/Desafio_4/InsurMinds – Desafio 4.docx
+++ b/Desafio_4/InsurMinds – Desafio 4.docx
@@ -431,6 +431,28 @@
             <w:rStyle w:val="Hyperlink"/>
           </w:rPr>
           <w:t>https://github.com/jpscard/InsurMinds/tree/main/Desafio%204</w:t>
+        </w:r>
+      </w:hyperlink>
+      <w:r>
+        <w:t xml:space="preserve"> </w:t>
+      </w:r>
+      <w:r>
+        <w:br/>
+      </w:r>
+      <w:proofErr w:type="spellStart"/>
+      <w:r>
+        <w:t>Aplicação</w:t>
+      </w:r>
+      <w:proofErr w:type="spellEnd"/>
+      <w:r>
+        <w:t xml:space="preserve"> </w:t>
+      </w:r>
+      <w:hyperlink r:id="rId7" w:history="1">
+        <w:r>
+          <w:rPr>
+            <w:rStyle w:val="Hyperlink"/>
+          </w:rPr>
+          <w:t>https://insurminds-k2jblmjyqfkstptsror6bd.streamlit.app/</w:t>
         </w:r>
       </w:hyperlink>
       <w:r>
@@ -2405,7 +2427,7 @@
                     <pic:cNvPicPr/>
                   </pic:nvPicPr>
                   <pic:blipFill>
-                    <a:blip r:embed="rId7"/>
+                    <a:blip r:embed="rId8"/>
                     <a:stretch>
                       <a:fillRect/>
                     </a:stretch>
@@ -2472,7 +2494,7 @@
                     <pic:cNvPicPr/>
                   </pic:nvPicPr>
                   <pic:blipFill>
-                    <a:blip r:embed="rId8"/>
+                    <a:blip r:embed="rId9"/>
                     <a:stretch>
                       <a:fillRect/>
                     </a:stretch>
@@ -2540,7 +2562,7 @@
                     <pic:cNvPicPr/>
                   </pic:nvPicPr>
                   <pic:blipFill>
-                    <a:blip r:embed="rId9"/>
+                    <a:blip r:embed="rId10"/>
                     <a:stretch>
                       <a:fillRect/>
                     </a:stretch>
@@ -2607,7 +2629,7 @@
                     <pic:cNvPicPr/>
                   </pic:nvPicPr>
                   <pic:blipFill>
-                    <a:blip r:embed="rId10"/>
+                    <a:blip r:embed="rId11"/>
                     <a:stretch>
                       <a:fillRect/>
                     </a:stretch>
@@ -2675,7 +2697,7 @@
                     <pic:cNvPicPr/>
                   </pic:nvPicPr>
                   <pic:blipFill>
-                    <a:blip r:embed="rId11"/>
+                    <a:blip r:embed="rId12"/>
                     <a:stretch>
                       <a:fillRect/>
                     </a:stretch>
@@ -2742,7 +2764,7 @@
                     <pic:cNvPicPr/>
                   </pic:nvPicPr>
                   <pic:blipFill>
-                    <a:blip r:embed="rId12"/>
+                    <a:blip r:embed="rId13"/>
                     <a:stretch>
                       <a:fillRect/>
                     </a:stretch>

</xml_diff>

<commit_message>
docs: atualiza documentacao principal README.md e sincroniza arquivos de relatorio
</commit_message>
<xml_diff>
--- a/Desafio_4/InsurMinds – Desafio 4.docx
+++ b/Desafio_4/InsurMinds – Desafio 4.docx
@@ -431,28 +431,6 @@
             <w:rStyle w:val="Hyperlink"/>
           </w:rPr>
           <w:t>https://github.com/jpscard/InsurMinds/tree/main/Desafio%204</w:t>
-        </w:r>
-      </w:hyperlink>
-      <w:r>
-        <w:t xml:space="preserve"> </w:t>
-      </w:r>
-      <w:r>
-        <w:br/>
-      </w:r>
-      <w:proofErr w:type="spellStart"/>
-      <w:r>
-        <w:t>Aplicação</w:t>
-      </w:r>
-      <w:proofErr w:type="spellEnd"/>
-      <w:r>
-        <w:t xml:space="preserve"> </w:t>
-      </w:r>
-      <w:hyperlink r:id="rId7" w:history="1">
-        <w:r>
-          <w:rPr>
-            <w:rStyle w:val="Hyperlink"/>
-          </w:rPr>
-          <w:t>https://insurminds-k2jblmjyqfkstptsror6bd.streamlit.app/</w:t>
         </w:r>
       </w:hyperlink>
       <w:r>
@@ -2427,7 +2405,7 @@
                     <pic:cNvPicPr/>
                   </pic:nvPicPr>
                   <pic:blipFill>
-                    <a:blip r:embed="rId8"/>
+                    <a:blip r:embed="rId7"/>
                     <a:stretch>
                       <a:fillRect/>
                     </a:stretch>
@@ -2494,7 +2472,7 @@
                     <pic:cNvPicPr/>
                   </pic:nvPicPr>
                   <pic:blipFill>
-                    <a:blip r:embed="rId9"/>
+                    <a:blip r:embed="rId8"/>
                     <a:stretch>
                       <a:fillRect/>
                     </a:stretch>
@@ -2562,7 +2540,7 @@
                     <pic:cNvPicPr/>
                   </pic:nvPicPr>
                   <pic:blipFill>
-                    <a:blip r:embed="rId10"/>
+                    <a:blip r:embed="rId9"/>
                     <a:stretch>
                       <a:fillRect/>
                     </a:stretch>
@@ -2629,7 +2607,7 @@
                     <pic:cNvPicPr/>
                   </pic:nvPicPr>
                   <pic:blipFill>
-                    <a:blip r:embed="rId11"/>
+                    <a:blip r:embed="rId10"/>
                     <a:stretch>
                       <a:fillRect/>
                     </a:stretch>
@@ -2697,7 +2675,7 @@
                     <pic:cNvPicPr/>
                   </pic:nvPicPr>
                   <pic:blipFill>
-                    <a:blip r:embed="rId12"/>
+                    <a:blip r:embed="rId11"/>
                     <a:stretch>
                       <a:fillRect/>
                     </a:stretch>
@@ -2764,7 +2742,7 @@
                     <pic:cNvPicPr/>
                   </pic:nvPicPr>
                   <pic:blipFill>
-                    <a:blip r:embed="rId13"/>
+                    <a:blip r:embed="rId12"/>
                     <a:stretch>
                       <a:fillRect/>
                     </a:stretch>

</xml_diff>